<commit_message>
Restructuration de la page Lots (colonnes, totaux, édition en ligne), création de TMA depuis l'interface, et nettoyage du référentiel Entreprises
</commit_message>
<xml_diff>
--- a/Remarques sur le paramétrage ddes lots.docx
+++ b/Remarques sur le paramétrage ddes lots.docx
@@ -12,8 +12,15 @@
     </w:p>
     <w:p/>
     <w:p>
+      <w:pPr>
+        <w:pStyle w:val="Paragraphedeliste"/>
+        <w:numPr>
+          <w:ilvl w:val="0"/>
+          <w:numId w:val="8"/>
+        </w:numPr>
+      </w:pPr>
       <w:r>
-        <w:t xml:space="preserve">Information du programme : </w:t>
+        <w:t>Référence : Appeler « N° du logement »</w:t>
       </w:r>
     </w:p>
     <w:p>
@@ -21,17 +28,41 @@
         <w:pStyle w:val="Paragraphedeliste"/>
         <w:numPr>
           <w:ilvl w:val="0"/>
-          <w:numId w:val="1"/>
+          <w:numId w:val="8"/>
         </w:numPr>
       </w:pPr>
       <w:r>
-        <w:t>Il faut rajouter une case « Date de livraison »</w:t>
+        <w:t>Si le nombre de logement dans la résidence est de 8, je ne dois pas pouvoir créer 9 logements</w:t>
+      </w:r>
+    </w:p>
+    <w:p>
+      <w:pPr>
+        <w:pStyle w:val="Paragraphedeliste"/>
+        <w:numPr>
+          <w:ilvl w:val="0"/>
+          <w:numId w:val="8"/>
+        </w:numPr>
+      </w:pPr>
+      <w:r>
+        <w:t>Caves : Appeler « Caves / Celliers »</w:t>
+      </w:r>
+    </w:p>
+    <w:p>
+      <w:pPr>
+        <w:pStyle w:val="Paragraphedeliste"/>
+        <w:numPr>
+          <w:ilvl w:val="0"/>
+          <w:numId w:val="8"/>
+        </w:numPr>
+      </w:pPr>
+      <w:r>
+        <w:t>Quand je complète toutes les cases, les nouvelles cases (terrasse, jardin, etc…) ne s’affichent pas dans le récapitulatif au-dessus</w:t>
       </w:r>
     </w:p>
     <w:p/>
     <w:p>
       <w:r>
-        <w:t>Délais et taux</w:t>
+        <w:t>Nouvelles remarques :</w:t>
       </w:r>
     </w:p>
     <w:p>
@@ -39,17 +70,65 @@
         <w:pStyle w:val="Paragraphedeliste"/>
         <w:numPr>
           <w:ilvl w:val="0"/>
-          <w:numId w:val="2"/>
+          <w:numId w:val="8"/>
         </w:numPr>
       </w:pPr>
       <w:r>
-        <w:t>Dans « Montant TMA négatif : Enlever ce qui est entre parenthèse « ancien comportement Excel »</w:t>
+        <w:t>Remplacer « Parkings » par « N° de parking », idem pour les caves /celliers.</w:t>
+      </w:r>
+    </w:p>
+    <w:p>
+      <w:pPr>
+        <w:pStyle w:val="Paragraphedeliste"/>
+        <w:numPr>
+          <w:ilvl w:val="0"/>
+          <w:numId w:val="8"/>
+        </w:numPr>
+      </w:pPr>
+      <w:r>
+        <w:t>Dans le résumé des lots au-dessus : remplacer « 10 parking » par « n° de parking : 10 », idem pour caves/celliers</w:t>
+      </w:r>
+    </w:p>
+    <w:p>
+      <w:pPr>
+        <w:pStyle w:val="Paragraphedeliste"/>
+        <w:numPr>
+          <w:ilvl w:val="0"/>
+          <w:numId w:val="8"/>
+        </w:numPr>
+      </w:pPr>
+      <w:r>
+        <w:t>JE ne dois pas pouvoir avoir 2 fois le même numéro de parking ou de caves/celliers</w:t>
+      </w:r>
+    </w:p>
+    <w:p>
+      <w:pPr>
+        <w:pStyle w:val="Paragraphedeliste"/>
+        <w:numPr>
+          <w:ilvl w:val="0"/>
+          <w:numId w:val="8"/>
+        </w:numPr>
+      </w:pPr>
+      <w:r>
+        <w:t>Le message de limite de logement atteint doit s’effacer quand je reviens au bon nombre.</w:t>
+      </w:r>
+    </w:p>
+    <w:p>
+      <w:pPr>
+        <w:pStyle w:val="Paragraphedeliste"/>
+        <w:numPr>
+          <w:ilvl w:val="0"/>
+          <w:numId w:val="8"/>
+        </w:numPr>
+      </w:pPr>
+      <w:r>
+        <w:t>Et je dois avoir un message quand j’ai rentré moins de logements que prévue.</w:t>
       </w:r>
     </w:p>
     <w:p/>
     <w:p>
       <w:r>
-        <w:t>Barème des phases de travaux :</w:t>
+        <w:t>Doc à rajouter :</w:t>
       </w:r>
     </w:p>
     <w:p>
@@ -57,213 +136,11 @@
         <w:pStyle w:val="Paragraphedeliste"/>
         <w:numPr>
           <w:ilvl w:val="0"/>
-          <w:numId w:val="3"/>
+          <w:numId w:val="9"/>
         </w:numPr>
       </w:pPr>
       <w:r>
-        <w:t>On doit pouvoir modifier l’ordre des phases de travaux</w:t>
-      </w:r>
-    </w:p>
-    <w:p/>
-    <w:p>
-      <w:r>
-        <w:t xml:space="preserve">Entreprises : </w:t>
-      </w:r>
-    </w:p>
-    <w:p>
-      <w:pPr>
-        <w:pStyle w:val="Paragraphedeliste"/>
-        <w:numPr>
-          <w:ilvl w:val="0"/>
-          <w:numId w:val="4"/>
-        </w:numPr>
-      </w:pPr>
-      <w:r>
-        <w:t>Il faut rajouter les cases : Adresse, commune et code postal</w:t>
-      </w:r>
-    </w:p>
-    <w:p/>
-    <w:p>
-      <w:r>
-        <w:t>Autres paramètres à rajouter :</w:t>
-      </w:r>
-    </w:p>
-    <w:p>
-      <w:pPr>
-        <w:pStyle w:val="Paragraphedeliste"/>
-        <w:numPr>
-          <w:ilvl w:val="0"/>
-          <w:numId w:val="5"/>
-        </w:numPr>
-      </w:pPr>
-      <w:r>
-        <w:t>C’est ici que l’on va remplir les informations des lots (n° de lot, étage …)</w:t>
-      </w:r>
-    </w:p>
-    <w:p/>
-    <w:p>
-      <w:r>
-        <w:t xml:space="preserve">Point à rajouter dans l’interface « Lots » </w:t>
-      </w:r>
-    </w:p>
-    <w:p>
-      <w:pPr>
-        <w:pStyle w:val="Paragraphedeliste"/>
-        <w:numPr>
-          <w:ilvl w:val="0"/>
-          <w:numId w:val="6"/>
-        </w:numPr>
-      </w:pPr>
-      <w:r>
-        <w:t>Il faut que les colonnes de l’interfaces correspondent à la pièce jointe « Synthèse programme »</w:t>
-      </w:r>
-    </w:p>
-    <w:p>
-      <w:pPr>
-        <w:pStyle w:val="Paragraphedeliste"/>
-        <w:numPr>
-          <w:ilvl w:val="0"/>
-          <w:numId w:val="6"/>
-        </w:numPr>
-      </w:pPr>
-      <w:r>
-        <w:t>On enlève l’ID client qui ne sert plus à rien à mon avis.</w:t>
-      </w:r>
-    </w:p>
-    <w:p>
-      <w:pPr>
-        <w:pStyle w:val="Paragraphedeliste"/>
-        <w:numPr>
-          <w:ilvl w:val="0"/>
-          <w:numId w:val="6"/>
-        </w:numPr>
-      </w:pPr>
-      <w:r>
-        <w:t>Les colonnes « Lot » jusqu’à « Prix TTC » doivent être paramétrable dans « Paramètres »</w:t>
-      </w:r>
-    </w:p>
-    <w:p>
-      <w:pPr>
-        <w:pStyle w:val="Paragraphedeliste"/>
-        <w:numPr>
-          <w:ilvl w:val="0"/>
-          <w:numId w:val="6"/>
-        </w:numPr>
-      </w:pPr>
-      <w:r>
-        <w:t>La colonne « Prix €/m² » doit être le résultat d’un calcul automatique « </w:t>
-      </w:r>
-      <w:proofErr w:type="spellStart"/>
-      <w:r>
-        <w:t>PrixTTC</w:t>
-      </w:r>
-      <w:proofErr w:type="spellEnd"/>
-      <w:r>
-        <w:t xml:space="preserve"> / Surface habitable »</w:t>
-      </w:r>
-    </w:p>
-    <w:p>
-      <w:pPr>
-        <w:pStyle w:val="Paragraphedeliste"/>
-        <w:numPr>
-          <w:ilvl w:val="0"/>
-          <w:numId w:val="6"/>
-        </w:numPr>
-      </w:pPr>
-      <w:r>
-        <w:t>Enlever les unités entre parenthèse des titres des colonnes et plutôt les mettre à coté des valeurs dans les lignes</w:t>
-      </w:r>
-    </w:p>
-    <w:p>
-      <w:pPr>
-        <w:pStyle w:val="Paragraphedeliste"/>
-        <w:numPr>
-          <w:ilvl w:val="0"/>
-          <w:numId w:val="6"/>
-        </w:numPr>
-      </w:pPr>
-      <w:r>
-        <w:t>On doit pouvoir modifier le statut du lot à la main.</w:t>
-      </w:r>
-    </w:p>
-    <w:p>
-      <w:pPr>
-        <w:pStyle w:val="Paragraphedeliste"/>
-        <w:numPr>
-          <w:ilvl w:val="0"/>
-          <w:numId w:val="6"/>
-        </w:numPr>
-      </w:pPr>
-      <w:r>
-        <w:t>La colonne Nom client va être une</w:t>
-      </w:r>
-      <w:r>
-        <w:t xml:space="preserve"> case </w:t>
-      </w:r>
-      <w:r>
-        <w:t>en saisie libre depuis l’interface où</w:t>
-      </w:r>
-      <w:r>
-        <w:t xml:space="preserve"> l’on va saisir directement la civilité et le nom de famille des clients, qui servira ensuite alimenter les cases correspondantes dans les autres interfaces.</w:t>
-      </w:r>
-    </w:p>
-    <w:p>
-      <w:pPr>
-        <w:pStyle w:val="Paragraphedeliste"/>
-        <w:numPr>
-          <w:ilvl w:val="0"/>
-          <w:numId w:val="6"/>
-        </w:numPr>
-      </w:pPr>
-      <w:r>
-        <w:t>Les colonnes date pourront également être remplie directement depuis l’interface</w:t>
-      </w:r>
-    </w:p>
-    <w:p/>
-    <w:p>
-      <w:r>
-        <w:t>Point à rajouter dans l’interface « TMA » :</w:t>
-      </w:r>
-    </w:p>
-    <w:p>
-      <w:pPr>
-        <w:pStyle w:val="Paragraphedeliste"/>
-        <w:numPr>
-          <w:ilvl w:val="0"/>
-          <w:numId w:val="7"/>
-        </w:numPr>
-      </w:pPr>
-      <w:r>
-        <w:t>Il faut créer un bouton « Ajouter une TMA »</w:t>
-      </w:r>
-    </w:p>
-    <w:p/>
-    <w:p>
-      <w:r>
-        <w:lastRenderedPageBreak/>
-        <w:t>Interface à créer :</w:t>
-      </w:r>
-    </w:p>
-    <w:p>
-      <w:pPr>
-        <w:pStyle w:val="Paragraphedeliste"/>
-        <w:numPr>
-          <w:ilvl w:val="0"/>
-          <w:numId w:val="8"/>
-        </w:numPr>
-      </w:pPr>
-      <w:r>
-        <w:t>Créer l’interface « Clients », dans laquelle on pourra remplir les coordonnées des clients (prénom, adresse, commune, code postal, téléphone, email). Cela si sera notamment utilisée pour générer un listing client (</w:t>
-      </w:r>
-      <w:proofErr w:type="spellStart"/>
-      <w:proofErr w:type="gramStart"/>
-      <w:r>
-        <w:t>a</w:t>
-      </w:r>
-      <w:proofErr w:type="spellEnd"/>
-      <w:proofErr w:type="gramEnd"/>
-      <w:r>
-        <w:t xml:space="preserve"> voir par la suite tout ce qui est export)</w:t>
+        <w:t>Faire la liste de toutes les modifications que je t’ai demandé depuis le début</w:t>
       </w:r>
     </w:p>
     <w:sectPr>
@@ -279,6 +156,95 @@
 <file path=word/numbering.xml><?xml version="1.0" encoding="utf-8"?>
 <w:numbering xmlns:wpc="http://schemas.microsoft.com/office/word/2010/wordprocessingCanvas" xmlns:cx="http://schemas.microsoft.com/office/drawing/2014/chartex" xmlns:cx1="http://schemas.microsoft.com/office/drawing/2015/9/8/chartex" xmlns:cx2="http://schemas.microsoft.com/office/drawing/2015/10/21/chartex" xmlns:cx3="http://schemas.microsoft.com/office/drawing/2016/5/9/chartex" xmlns:cx4="http://schemas.microsoft.com/office/drawing/2016/5/10/chartex" xmlns:cx5="http://schemas.microsoft.com/office/drawing/2016/5/11/chartex" xmlns:cx6="http://schemas.microsoft.com/office/drawing/2016/5/12/chartex" xmlns:cx7="http://schemas.microsoft.com/office/drawing/2016/5/13/chartex" xmlns:cx8="http://schemas.microsoft.com/office/drawing/2016/5/14/chartex" xmlns:mc="http://schemas.openxmlformats.org/markup-compatibility/2006" xmlns:aink="http://schemas.microsoft.com/office/drawing/2016/ink" xmlns:am3d="http://schemas.microsoft.com/office/drawing/2017/model3d" xmlns:o="urn:schemas-microsoft-com:office:office" xmlns:oel="http://schemas.microsoft.com/office/2019/extlst" xmlns:r="http://schemas.openxmlformats.org/officeDocument/2006/relationships" xmlns:m="http://schemas.openxmlformats.org/officeDocument/2006/math" xmlns:v="urn:schemas-microsoft-com:vml" xmlns:wp14="http://schemas.microsoft.com/office/word/2010/wordprocessingDrawing" xmlns:wp="http://schemas.openxmlformats.org/drawingml/2006/wordprocessingDrawing" xmlns:w10="urn:schemas-microsoft-com:office:word" xmlns:w="http://schemas.openxmlformats.org/wordprocessingml/2006/main" xmlns:w14="http://schemas.microsoft.com/office/word/2010/wordml" xmlns:w15="http://schemas.microsoft.com/office/word/2012/wordml" xmlns:w16cex="http://schemas.microsoft.com/office/word/2018/wordml/cex" xmlns:w16cid="http://schemas.microsoft.com/office/word/2016/wordml/cid" xmlns:w16="http://schemas.microsoft.com/office/word/2018/wordml" xmlns:w16du="http://schemas.microsoft.com/office/word/2023/wordml/word16du" xmlns:w16sdtdh="http://schemas.microsoft.com/office/word/2020/wordml/sdtdatahash" xmlns:w16sdtfl="http://schemas.microsoft.com/office/word/2024/wordml/sdtformatlock" xmlns:w16se="http://schemas.microsoft.com/office/word/2015/wordml/symex" xmlns:wpg="http://schemas.microsoft.com/office/word/2010/wordprocessingGroup" xmlns:wpi="http://schemas.microsoft.com/office/word/2010/wordprocessingInk" xmlns:wne="http://schemas.microsoft.com/office/word/2006/wordml" xmlns:wps="http://schemas.microsoft.com/office/word/2010/wordprocessingShape" mc:Ignorable="w14 w15 w16se w16cid w16 w16cex w16sdtdh w16sdtfl w16du wp14">
   <w:abstractNum w:abstractNumId="0" w15:restartNumberingAfterBreak="0">
+    <w:nsid w:val="098903BF"/>
+    <w:multiLevelType w:val="hybridMultilevel"/>
+    <w:tmpl w:val="ACAA752C"/>
+    <w:lvl w:ilvl="0" w:tplc="040C000F">
+      <w:start w:val="1"/>
+      <w:numFmt w:val="decimal"/>
+      <w:lvlText w:val="%1."/>
+      <w:lvlJc w:val="left"/>
+      <w:pPr>
+        <w:ind w:left="720" w:hanging="360"/>
+      </w:pPr>
+      <w:rPr>
+        <w:rFonts w:hint="default"/>
+      </w:rPr>
+    </w:lvl>
+    <w:lvl w:ilvl="1" w:tplc="040C0019" w:tentative="1">
+      <w:start w:val="1"/>
+      <w:numFmt w:val="lowerLetter"/>
+      <w:lvlText w:val="%2."/>
+      <w:lvlJc w:val="left"/>
+      <w:pPr>
+        <w:ind w:left="1440" w:hanging="360"/>
+      </w:pPr>
+    </w:lvl>
+    <w:lvl w:ilvl="2" w:tplc="040C001B" w:tentative="1">
+      <w:start w:val="1"/>
+      <w:numFmt w:val="lowerRoman"/>
+      <w:lvlText w:val="%3."/>
+      <w:lvlJc w:val="right"/>
+      <w:pPr>
+        <w:ind w:left="2160" w:hanging="180"/>
+      </w:pPr>
+    </w:lvl>
+    <w:lvl w:ilvl="3" w:tplc="040C000F" w:tentative="1">
+      <w:start w:val="1"/>
+      <w:numFmt w:val="decimal"/>
+      <w:lvlText w:val="%4."/>
+      <w:lvlJc w:val="left"/>
+      <w:pPr>
+        <w:ind w:left="2880" w:hanging="360"/>
+      </w:pPr>
+    </w:lvl>
+    <w:lvl w:ilvl="4" w:tplc="040C0019" w:tentative="1">
+      <w:start w:val="1"/>
+      <w:numFmt w:val="lowerLetter"/>
+      <w:lvlText w:val="%5."/>
+      <w:lvlJc w:val="left"/>
+      <w:pPr>
+        <w:ind w:left="3600" w:hanging="360"/>
+      </w:pPr>
+    </w:lvl>
+    <w:lvl w:ilvl="5" w:tplc="040C001B" w:tentative="1">
+      <w:start w:val="1"/>
+      <w:numFmt w:val="lowerRoman"/>
+      <w:lvlText w:val="%6."/>
+      <w:lvlJc w:val="right"/>
+      <w:pPr>
+        <w:ind w:left="4320" w:hanging="180"/>
+      </w:pPr>
+    </w:lvl>
+    <w:lvl w:ilvl="6" w:tplc="040C000F" w:tentative="1">
+      <w:start w:val="1"/>
+      <w:numFmt w:val="decimal"/>
+      <w:lvlText w:val="%7."/>
+      <w:lvlJc w:val="left"/>
+      <w:pPr>
+        <w:ind w:left="5040" w:hanging="360"/>
+      </w:pPr>
+    </w:lvl>
+    <w:lvl w:ilvl="7" w:tplc="040C0019" w:tentative="1">
+      <w:start w:val="1"/>
+      <w:numFmt w:val="lowerLetter"/>
+      <w:lvlText w:val="%8."/>
+      <w:lvlJc w:val="left"/>
+      <w:pPr>
+        <w:ind w:left="5760" w:hanging="360"/>
+      </w:pPr>
+    </w:lvl>
+    <w:lvl w:ilvl="8" w:tplc="040C001B" w:tentative="1">
+      <w:start w:val="1"/>
+      <w:numFmt w:val="lowerRoman"/>
+      <w:lvlText w:val="%9."/>
+      <w:lvlJc w:val="right"/>
+      <w:pPr>
+        <w:ind w:left="6480" w:hanging="180"/>
+      </w:pPr>
+    </w:lvl>
+  </w:abstractNum>
+  <w:abstractNum w:abstractNumId="1" w15:restartNumberingAfterBreak="0">
     <w:nsid w:val="0A5E7801"/>
     <w:multiLevelType w:val="hybridMultilevel"/>
     <w:tmpl w:val="AD04F9A0"/>
@@ -367,7 +333,7 @@
       </w:pPr>
     </w:lvl>
   </w:abstractNum>
-  <w:abstractNum w:abstractNumId="1" w15:restartNumberingAfterBreak="0">
+  <w:abstractNum w:abstractNumId="2" w15:restartNumberingAfterBreak="0">
     <w:nsid w:val="21753924"/>
     <w:multiLevelType w:val="hybridMultilevel"/>
     <w:tmpl w:val="BD646046"/>
@@ -456,7 +422,7 @@
       </w:pPr>
     </w:lvl>
   </w:abstractNum>
-  <w:abstractNum w:abstractNumId="2" w15:restartNumberingAfterBreak="0">
+  <w:abstractNum w:abstractNumId="3" w15:restartNumberingAfterBreak="0">
     <w:nsid w:val="2F784BEC"/>
     <w:multiLevelType w:val="hybridMultilevel"/>
     <w:tmpl w:val="D066656C"/>
@@ -545,7 +511,7 @@
       </w:pPr>
     </w:lvl>
   </w:abstractNum>
-  <w:abstractNum w:abstractNumId="3" w15:restartNumberingAfterBreak="0">
+  <w:abstractNum w:abstractNumId="4" w15:restartNumberingAfterBreak="0">
     <w:nsid w:val="3BC94F44"/>
     <w:multiLevelType w:val="hybridMultilevel"/>
     <w:tmpl w:val="BACEF614"/>
@@ -634,7 +600,7 @@
       </w:pPr>
     </w:lvl>
   </w:abstractNum>
-  <w:abstractNum w:abstractNumId="4" w15:restartNumberingAfterBreak="0">
+  <w:abstractNum w:abstractNumId="5" w15:restartNumberingAfterBreak="0">
     <w:nsid w:val="3EE05138"/>
     <w:multiLevelType w:val="hybridMultilevel"/>
     <w:tmpl w:val="20224128"/>
@@ -723,7 +689,7 @@
       </w:pPr>
     </w:lvl>
   </w:abstractNum>
-  <w:abstractNum w:abstractNumId="5" w15:restartNumberingAfterBreak="0">
+  <w:abstractNum w:abstractNumId="6" w15:restartNumberingAfterBreak="0">
     <w:nsid w:val="50AB7305"/>
     <w:multiLevelType w:val="hybridMultilevel"/>
     <w:tmpl w:val="D556D26E"/>
@@ -812,7 +778,7 @@
       </w:pPr>
     </w:lvl>
   </w:abstractNum>
-  <w:abstractNum w:abstractNumId="6" w15:restartNumberingAfterBreak="0">
+  <w:abstractNum w:abstractNumId="7" w15:restartNumberingAfterBreak="0">
     <w:nsid w:val="64525EDA"/>
     <w:multiLevelType w:val="hybridMultilevel"/>
     <w:tmpl w:val="8F6A4CB6"/>
@@ -901,7 +867,7 @@
       </w:pPr>
     </w:lvl>
   </w:abstractNum>
-  <w:abstractNum w:abstractNumId="7" w15:restartNumberingAfterBreak="0">
+  <w:abstractNum w:abstractNumId="8" w15:restartNumberingAfterBreak="0">
     <w:nsid w:val="7A8518E2"/>
     <w:multiLevelType w:val="hybridMultilevel"/>
     <w:tmpl w:val="6F208AE8"/>
@@ -991,28 +957,31 @@
     </w:lvl>
   </w:abstractNum>
   <w:num w:numId="1" w16cid:durableId="1969164424">
+    <w:abstractNumId w:val="2"/>
+  </w:num>
+  <w:num w:numId="2" w16cid:durableId="2040739031">
+    <w:abstractNumId w:val="4"/>
+  </w:num>
+  <w:num w:numId="3" w16cid:durableId="921260736">
     <w:abstractNumId w:val="1"/>
   </w:num>
-  <w:num w:numId="2" w16cid:durableId="2040739031">
+  <w:num w:numId="4" w16cid:durableId="385957258">
+    <w:abstractNumId w:val="5"/>
+  </w:num>
+  <w:num w:numId="5" w16cid:durableId="511577584">
     <w:abstractNumId w:val="3"/>
   </w:num>
-  <w:num w:numId="3" w16cid:durableId="921260736">
-    <w:abstractNumId w:val="0"/>
+  <w:num w:numId="6" w16cid:durableId="1995142580">
+    <w:abstractNumId w:val="7"/>
   </w:num>
-  <w:num w:numId="4" w16cid:durableId="385957258">
-    <w:abstractNumId w:val="4"/>
-  </w:num>
-  <w:num w:numId="5" w16cid:durableId="511577584">
-    <w:abstractNumId w:val="2"/>
-  </w:num>
-  <w:num w:numId="6" w16cid:durableId="1995142580">
+  <w:num w:numId="7" w16cid:durableId="581766046">
     <w:abstractNumId w:val="6"/>
   </w:num>
-  <w:num w:numId="7" w16cid:durableId="581766046">
-    <w:abstractNumId w:val="5"/>
+  <w:num w:numId="8" w16cid:durableId="72893795">
+    <w:abstractNumId w:val="8"/>
   </w:num>
-  <w:num w:numId="8" w16cid:durableId="72893795">
-    <w:abstractNumId w:val="7"/>
+  <w:num w:numId="9" w16cid:durableId="736708227">
+    <w:abstractNumId w:val="0"/>
   </w:num>
 </w:numbering>
 </file>

</xml_diff>